<commit_message>
docs: add MER and DER appendices preserving original documentation
</commit_message>
<xml_diff>
--- a/docs/documentacao/Nexly_Documentação.docx
+++ b/docs/documentacao/Nexly_Documentação.docx
@@ -17248,12 +17248,630 @@
         </w:rPr>
       </w:r>
     </w:p>
+    <w:p>
+      <w:pPr>
+        <w:spacing w:before="0" w:after="0" w:line="20" w:lineRule="exact"/>
+        <w:sectPr>
+          <w:headerReference r:id="rId19" w:type="default"/>
+          <w:footerReference r:id="rId20" w:type="default"/>
+          <w:type w:val="nextPage"/>
+          <w:pgSz w:h="16838" w:w="11906" w:orient="portrait"/>
+          <w:pgMar w:bottom="1133.8582677165355" w:top="1700.7874015748032" w:left="1700.7874015748032" w:right="1133.8582677165355" w:header="850" w:footer="567"/>
+        </w:sectPr>
+      </w:pPr>
+    </w:p>
+    <w:p>
+      <w:pPr>
+        <w:pStyle w:val="Normal"/>
+        <w:spacing w:before="0" w:after="120" w:line="240" w:lineRule="auto"/>
+        <w:ind w:left="0" w:right="0" w:firstLine="0"/>
+        <w:jc w:val="left"/>
+      </w:pPr>
+      <w:r>
+        <w:rPr>
+          <w:rFonts w:ascii="Arial" w:hAnsi="Arial"/>
+          <w:color w:val="000000"/>
+          <w:sz w:val="24"/>
+          <w:b/>
+        </w:rPr>
+        <w:t>APÊNDICE A — MER do núcleo do Nexly</w:t>
+      </w:r>
+    </w:p>
+    <w:p>
+      <w:pPr>
+        <w:pStyle w:val="Normal"/>
+        <w:spacing w:before="0" w:after="120" w:line="240" w:lineRule="auto"/>
+        <w:ind w:left="0" w:right="0" w:firstLine="0"/>
+        <w:jc w:val="left"/>
+      </w:pPr>
+      <w:r>
+        <w:rPr>
+          <w:rFonts w:ascii="Arial" w:hAnsi="Arial"/>
+          <w:color w:val="000000"/>
+          <w:sz w:val="21"/>
+        </w:rPr>
+        <w:t>Modelo de Entidade e Relacionamento — visão conceitual das entidades centrais.</w:t>
+      </w:r>
+    </w:p>
+    <w:p>
+      <w:pPr>
+        <w:spacing w:before="0" w:after="80" w:line="240" w:lineRule="auto"/>
+        <w:ind w:left="0" w:firstLine="0"/>
+        <w:jc w:val="center"/>
+      </w:pPr>
+      <w:r>
+        <w:drawing>
+          <wp:inline distT="0" distB="0" distL="0" distR="0">
+            <wp:extent cx="13500000" cy="3268814"/>
+            <wp:docPr id="9" name="mer" descr="mer do Nexly baseado no schema Prisma"/>
+            <wp:cNvGraphicFramePr>
+              <a:graphicFrameLocks noChangeAspect="1"/>
+            </wp:cNvGraphicFramePr>
+            <a:graphic>
+              <a:graphicData uri="http://schemas.openxmlformats.org/drawingml/2006/picture">
+                <pic:pic>
+                  <pic:nvPicPr>
+                    <pic:cNvPr id="0" name="mer.png"/>
+                    <pic:cNvPicPr/>
+                  </pic:nvPicPr>
+                  <pic:blipFill>
+                    <a:blip r:embed="rId21"/>
+                    <a:stretch>
+                      <a:fillRect/>
+                    </a:stretch>
+                  </pic:blipFill>
+                  <pic:spPr>
+                    <a:xfrm>
+                      <a:off x="0" y="0"/>
+                      <a:ext cx="13500000" cy="3268814"/>
+                    </a:xfrm>
+                    <a:prstGeom prst="rect">
+                      <a:avLst/>
+                    </a:prstGeom>
+                  </pic:spPr>
+                </pic:pic>
+              </a:graphicData>
+            </a:graphic>
+          </wp:inline>
+        </w:drawing>
+      </w:r>
+    </w:p>
+    <w:p>
+      <w:pPr>
+        <w:pStyle w:val="Normal"/>
+        <w:spacing w:before="0" w:after="120" w:line="240" w:lineRule="auto"/>
+        <w:ind w:left="0" w:right="0" w:firstLine="0"/>
+        <w:jc w:val="left"/>
+      </w:pPr>
+      <w:r>
+        <w:rPr>
+          <w:rFonts w:ascii="Arial" w:hAnsi="Arial"/>
+          <w:color w:val="000000"/>
+          <w:sz w:val="20"/>
+        </w:rPr>
+        <w:t>Legenda: 1 = uma ocorrência; 0..1 = ocorrência opcional; 0..N = zero ou várias. Os relacionamentos N:N de consumo e itens de venda são resolvidos por InsumoServico e ItemVenda no DER.</w:t>
+      </w:r>
+    </w:p>
+    <w:p>
+      <w:pPr>
+        <w:pStyle w:val="Normal"/>
+        <w:spacing w:before="0" w:after="120" w:line="240" w:lineRule="auto"/>
+        <w:ind w:left="0" w:right="0" w:firstLine="0"/>
+        <w:jc w:val="left"/>
+      </w:pPr>
+      <w:r>
+        <w:rPr>
+          <w:rFonts w:ascii="Arial" w:hAnsi="Arial"/>
+          <w:color w:val="000000"/>
+          <w:sz w:val="20"/>
+        </w:rPr>
+        <w:t>Fonte: elaboração própria com base em apps/api/prisma/schema.prisma do Nexly.</w:t>
+      </w:r>
+    </w:p>
+    <w:p>
+      <w:pPr>
+        <w:pStyle w:val="Normal"/>
+        <w:spacing w:before="0" w:after="120" w:line="240" w:lineRule="auto"/>
+        <w:ind w:left="0" w:right="0" w:firstLine="0"/>
+        <w:jc w:val="left"/>
+        <w:pageBreakBefore/>
+      </w:pPr>
+      <w:r>
+        <w:rPr>
+          <w:rFonts w:ascii="Arial" w:hAnsi="Arial"/>
+          <w:color w:val="000000"/>
+          <w:sz w:val="24"/>
+          <w:b/>
+        </w:rPr>
+        <w:t>APÊNDICE B — DER de identidade e assinatura</w:t>
+      </w:r>
+    </w:p>
+    <w:p>
+      <w:pPr>
+        <w:pStyle w:val="Normal"/>
+        <w:spacing w:before="0" w:after="120" w:line="240" w:lineRule="auto"/>
+        <w:ind w:left="0" w:right="0" w:firstLine="0"/>
+        <w:jc w:val="left"/>
+      </w:pPr>
+      <w:r>
+        <w:rPr>
+          <w:rFonts w:ascii="Arial" w:hAnsi="Arial"/>
+          <w:color w:val="000000"/>
+          <w:sz w:val="21"/>
+        </w:rPr>
+        <w:t>Diagrama de Entidade e Relacionamento — visão 1 de 4; conjunto com os 41 modelos persistidos.</w:t>
+      </w:r>
+    </w:p>
+    <w:p>
+      <w:pPr>
+        <w:spacing w:before="0" w:after="80" w:line="240" w:lineRule="auto"/>
+        <w:ind w:left="0" w:firstLine="0"/>
+        <w:jc w:val="center"/>
+      </w:pPr>
+      <w:r>
+        <w:drawing>
+          <wp:inline distT="0" distB="0" distL="0" distR="0">
+            <wp:extent cx="8072074" cy="7704000"/>
+            <wp:docPr id="10" name="der-1" descr="der-1 do Nexly baseado no schema Prisma"/>
+            <wp:cNvGraphicFramePr>
+              <a:graphicFrameLocks noChangeAspect="1"/>
+            </wp:cNvGraphicFramePr>
+            <a:graphic>
+              <a:graphicData uri="http://schemas.openxmlformats.org/drawingml/2006/picture">
+                <pic:pic>
+                  <pic:nvPicPr>
+                    <pic:cNvPr id="0" name="der-1.png"/>
+                    <pic:cNvPicPr/>
+                  </pic:nvPicPr>
+                  <pic:blipFill>
+                    <a:blip r:embed="rId22"/>
+                    <a:stretch>
+                      <a:fillRect/>
+                    </a:stretch>
+                  </pic:blipFill>
+                  <pic:spPr>
+                    <a:xfrm>
+                      <a:off x="0" y="0"/>
+                      <a:ext cx="8072074" cy="7704000"/>
+                    </a:xfrm>
+                    <a:prstGeom prst="rect">
+                      <a:avLst/>
+                    </a:prstGeom>
+                  </pic:spPr>
+                </pic:pic>
+              </a:graphicData>
+            </a:graphic>
+          </wp:inline>
+        </w:drawing>
+      </w:r>
+    </w:p>
+    <w:p>
+      <w:pPr>
+        <w:pStyle w:val="Normal"/>
+        <w:spacing w:before="0" w:after="120" w:line="240" w:lineRule="auto"/>
+        <w:ind w:left="0" w:right="0" w:firstLine="0"/>
+        <w:jc w:val="left"/>
+      </w:pPr>
+      <w:r>
+        <w:rPr>
+          <w:rFonts w:ascii="Arial" w:hAnsi="Arial"/>
+          <w:color w:val="000000"/>
+          <w:sz w:val="20"/>
+        </w:rPr>
+        <w:t>Legenda: PK = chave primária; UK = unicidade do campo; FK = chave estrangeira; ESC = escopo por empresa sem FK declarada; ? = opcional. Atributos principais selecionados; tipos conforme Prisma.</w:t>
+      </w:r>
+    </w:p>
+    <w:p>
+      <w:pPr>
+        <w:pStyle w:val="Normal"/>
+        <w:spacing w:before="0" w:after="120" w:line="240" w:lineRule="auto"/>
+        <w:ind w:left="0" w:right="0" w:firstLine="0"/>
+        <w:jc w:val="left"/>
+      </w:pPr>
+      <w:r>
+        <w:rPr>
+          <w:rFonts w:ascii="Arial" w:hAnsi="Arial"/>
+          <w:color w:val="000000"/>
+          <w:sz w:val="20"/>
+        </w:rPr>
+        <w:t>As linhas mostram relações internas selecionadas. Os destinos das demais FKs, inclusive entre visões e para empresas, constam nos campos. Nomes de tabelas conforme o mapeamento do schema.</w:t>
+      </w:r>
+    </w:p>
+    <w:p>
+      <w:pPr>
+        <w:pStyle w:val="Normal"/>
+        <w:spacing w:before="0" w:after="120" w:line="240" w:lineRule="auto"/>
+        <w:ind w:left="0" w:right="0" w:firstLine="0"/>
+        <w:jc w:val="left"/>
+      </w:pPr>
+      <w:r>
+        <w:rPr>
+          <w:rFonts w:ascii="Arial" w:hAnsi="Arial"/>
+          <w:color w:val="000000"/>
+          <w:sz w:val="20"/>
+        </w:rPr>
+        <w:t>Fonte: elaboração própria com base em apps/api/prisma/schema.prisma do Nexly.</w:t>
+      </w:r>
+    </w:p>
+    <w:p>
+      <w:pPr>
+        <w:pStyle w:val="Normal"/>
+        <w:spacing w:before="0" w:after="120" w:line="240" w:lineRule="auto"/>
+        <w:ind w:left="0" w:right="0" w:firstLine="0"/>
+        <w:jc w:val="left"/>
+        <w:pageBreakBefore/>
+      </w:pPr>
+      <w:r>
+        <w:rPr>
+          <w:rFonts w:ascii="Arial" w:hAnsi="Arial"/>
+          <w:color w:val="000000"/>
+          <w:sz w:val="24"/>
+          <w:b/>
+        </w:rPr>
+        <w:t>APÊNDICE B — DER de atendimento estoque e vendas</w:t>
+      </w:r>
+    </w:p>
+    <w:p>
+      <w:pPr>
+        <w:pStyle w:val="Normal"/>
+        <w:spacing w:before="0" w:after="120" w:line="240" w:lineRule="auto"/>
+        <w:ind w:left="0" w:right="0" w:firstLine="0"/>
+        <w:jc w:val="left"/>
+      </w:pPr>
+      <w:r>
+        <w:rPr>
+          <w:rFonts w:ascii="Arial" w:hAnsi="Arial"/>
+          <w:color w:val="000000"/>
+          <w:sz w:val="21"/>
+        </w:rPr>
+        <w:t>Diagrama de Entidade e Relacionamento — visão 2 de 4; conjunto com os 41 modelos persistidos.</w:t>
+      </w:r>
+    </w:p>
+    <w:p>
+      <w:pPr>
+        <w:spacing w:before="0" w:after="80" w:line="240" w:lineRule="auto"/>
+        <w:ind w:left="0" w:firstLine="0"/>
+        <w:jc w:val="center"/>
+      </w:pPr>
+      <w:r>
+        <w:drawing>
+          <wp:inline distT="0" distB="0" distL="0" distR="0">
+            <wp:extent cx="8131573" cy="7704000"/>
+            <wp:docPr id="11" name="der-2" descr="der-2 do Nexly baseado no schema Prisma"/>
+            <wp:cNvGraphicFramePr>
+              <a:graphicFrameLocks noChangeAspect="1"/>
+            </wp:cNvGraphicFramePr>
+            <a:graphic>
+              <a:graphicData uri="http://schemas.openxmlformats.org/drawingml/2006/picture">
+                <pic:pic>
+                  <pic:nvPicPr>
+                    <pic:cNvPr id="0" name="der-2.png"/>
+                    <pic:cNvPicPr/>
+                  </pic:nvPicPr>
+                  <pic:blipFill>
+                    <a:blip r:embed="rId23"/>
+                    <a:stretch>
+                      <a:fillRect/>
+                    </a:stretch>
+                  </pic:blipFill>
+                  <pic:spPr>
+                    <a:xfrm>
+                      <a:off x="0" y="0"/>
+                      <a:ext cx="8131573" cy="7704000"/>
+                    </a:xfrm>
+                    <a:prstGeom prst="rect">
+                      <a:avLst/>
+                    </a:prstGeom>
+                  </pic:spPr>
+                </pic:pic>
+              </a:graphicData>
+            </a:graphic>
+          </wp:inline>
+        </w:drawing>
+      </w:r>
+    </w:p>
+    <w:p>
+      <w:pPr>
+        <w:pStyle w:val="Normal"/>
+        <w:spacing w:before="0" w:after="120" w:line="240" w:lineRule="auto"/>
+        <w:ind w:left="0" w:right="0" w:firstLine="0"/>
+        <w:jc w:val="left"/>
+      </w:pPr>
+      <w:r>
+        <w:rPr>
+          <w:rFonts w:ascii="Arial" w:hAnsi="Arial"/>
+          <w:color w:val="000000"/>
+          <w:sz w:val="20"/>
+        </w:rPr>
+        <w:t>Legenda: PK = chave primária; UK = unicidade do campo; FK = chave estrangeira; ESC = escopo por empresa sem FK declarada; ? = opcional. Atributos principais selecionados; tipos conforme Prisma.</w:t>
+      </w:r>
+    </w:p>
+    <w:p>
+      <w:pPr>
+        <w:pStyle w:val="Normal"/>
+        <w:spacing w:before="0" w:after="120" w:line="240" w:lineRule="auto"/>
+        <w:ind w:left="0" w:right="0" w:firstLine="0"/>
+        <w:jc w:val="left"/>
+      </w:pPr>
+      <w:r>
+        <w:rPr>
+          <w:rFonts w:ascii="Arial" w:hAnsi="Arial"/>
+          <w:color w:val="000000"/>
+          <w:sz w:val="20"/>
+        </w:rPr>
+        <w:t>As linhas mostram relações internas selecionadas. Os destinos das demais FKs, inclusive entre visões e para empresas, constam nos campos. Nomes de tabelas conforme o mapeamento do schema.</w:t>
+      </w:r>
+    </w:p>
+    <w:p>
+      <w:pPr>
+        <w:pStyle w:val="Normal"/>
+        <w:spacing w:before="0" w:after="120" w:line="240" w:lineRule="auto"/>
+        <w:ind w:left="0" w:right="0" w:firstLine="0"/>
+        <w:jc w:val="left"/>
+      </w:pPr>
+      <w:r>
+        <w:rPr>
+          <w:rFonts w:ascii="Arial" w:hAnsi="Arial"/>
+          <w:color w:val="000000"/>
+          <w:sz w:val="20"/>
+        </w:rPr>
+        <w:t>Fonte: elaboração própria com base em apps/api/prisma/schema.prisma do Nexly.</w:t>
+      </w:r>
+    </w:p>
+    <w:p>
+      <w:pPr>
+        <w:pStyle w:val="Normal"/>
+        <w:spacing w:before="0" w:after="120" w:line="240" w:lineRule="auto"/>
+        <w:ind w:left="0" w:right="0" w:firstLine="0"/>
+        <w:jc w:val="left"/>
+        <w:pageBreakBefore/>
+      </w:pPr>
+      <w:r>
+        <w:rPr>
+          <w:rFonts w:ascii="Arial" w:hAnsi="Arial"/>
+          <w:color w:val="000000"/>
+          <w:sz w:val="24"/>
+          <w:b/>
+        </w:rPr>
+        <w:t>APÊNDICE B — DER de compras financeiro e filiais</w:t>
+      </w:r>
+    </w:p>
+    <w:p>
+      <w:pPr>
+        <w:pStyle w:val="Normal"/>
+        <w:spacing w:before="0" w:after="120" w:line="240" w:lineRule="auto"/>
+        <w:ind w:left="0" w:right="0" w:firstLine="0"/>
+        <w:jc w:val="left"/>
+      </w:pPr>
+      <w:r>
+        <w:rPr>
+          <w:rFonts w:ascii="Arial" w:hAnsi="Arial"/>
+          <w:color w:val="000000"/>
+          <w:sz w:val="21"/>
+        </w:rPr>
+        <w:t>Diagrama de Entidade e Relacionamento — visão 3 de 4; conjunto com os 41 modelos persistidos.</w:t>
+      </w:r>
+    </w:p>
+    <w:p>
+      <w:pPr>
+        <w:spacing w:before="0" w:after="80" w:line="240" w:lineRule="auto"/>
+        <w:ind w:left="0" w:firstLine="0"/>
+        <w:jc w:val="center"/>
+      </w:pPr>
+      <w:r>
+        <w:drawing>
+          <wp:inline distT="0" distB="0" distL="0" distR="0">
+            <wp:extent cx="11532075" cy="7704000"/>
+            <wp:docPr id="12" name="der-3" descr="der-3 do Nexly baseado no schema Prisma"/>
+            <wp:cNvGraphicFramePr>
+              <a:graphicFrameLocks noChangeAspect="1"/>
+            </wp:cNvGraphicFramePr>
+            <a:graphic>
+              <a:graphicData uri="http://schemas.openxmlformats.org/drawingml/2006/picture">
+                <pic:pic>
+                  <pic:nvPicPr>
+                    <pic:cNvPr id="0" name="der-3.png"/>
+                    <pic:cNvPicPr/>
+                  </pic:nvPicPr>
+                  <pic:blipFill>
+                    <a:blip r:embed="rId24"/>
+                    <a:stretch>
+                      <a:fillRect/>
+                    </a:stretch>
+                  </pic:blipFill>
+                  <pic:spPr>
+                    <a:xfrm>
+                      <a:off x="0" y="0"/>
+                      <a:ext cx="11532075" cy="7704000"/>
+                    </a:xfrm>
+                    <a:prstGeom prst="rect">
+                      <a:avLst/>
+                    </a:prstGeom>
+                  </pic:spPr>
+                </pic:pic>
+              </a:graphicData>
+            </a:graphic>
+          </wp:inline>
+        </w:drawing>
+      </w:r>
+    </w:p>
+    <w:p>
+      <w:pPr>
+        <w:pStyle w:val="Normal"/>
+        <w:spacing w:before="0" w:after="120" w:line="240" w:lineRule="auto"/>
+        <w:ind w:left="0" w:right="0" w:firstLine="0"/>
+        <w:jc w:val="left"/>
+      </w:pPr>
+      <w:r>
+        <w:rPr>
+          <w:rFonts w:ascii="Arial" w:hAnsi="Arial"/>
+          <w:color w:val="000000"/>
+          <w:sz w:val="20"/>
+        </w:rPr>
+        <w:t>Legenda: PK = chave primária; UK = unicidade do campo; FK = chave estrangeira; ESC = escopo por empresa sem FK declarada; ? = opcional. Atributos principais selecionados; tipos conforme Prisma.</w:t>
+      </w:r>
+    </w:p>
+    <w:p>
+      <w:pPr>
+        <w:pStyle w:val="Normal"/>
+        <w:spacing w:before="0" w:after="120" w:line="240" w:lineRule="auto"/>
+        <w:ind w:left="0" w:right="0" w:firstLine="0"/>
+        <w:jc w:val="left"/>
+      </w:pPr>
+      <w:r>
+        <w:rPr>
+          <w:rFonts w:ascii="Arial" w:hAnsi="Arial"/>
+          <w:color w:val="000000"/>
+          <w:sz w:val="20"/>
+        </w:rPr>
+        <w:t>As linhas mostram relações internas selecionadas. Os destinos das demais FKs, inclusive entre visões e para empresas, constam nos campos. Nomes de tabelas conforme o mapeamento do schema.</w:t>
+      </w:r>
+    </w:p>
+    <w:p>
+      <w:pPr>
+        <w:pStyle w:val="Normal"/>
+        <w:spacing w:before="0" w:after="120" w:line="240" w:lineRule="auto"/>
+        <w:ind w:left="0" w:right="0" w:firstLine="0"/>
+        <w:jc w:val="left"/>
+      </w:pPr>
+      <w:r>
+        <w:rPr>
+          <w:rFonts w:ascii="Arial" w:hAnsi="Arial"/>
+          <w:color w:val="000000"/>
+          <w:sz w:val="20"/>
+        </w:rPr>
+        <w:t>Fonte: elaboração própria com base em apps/api/prisma/schema.prisma do Nexly.</w:t>
+      </w:r>
+    </w:p>
+    <w:p>
+      <w:pPr>
+        <w:pStyle w:val="Normal"/>
+        <w:spacing w:before="0" w:after="120" w:line="240" w:lineRule="auto"/>
+        <w:ind w:left="0" w:right="0" w:firstLine="0"/>
+        <w:jc w:val="left"/>
+        <w:pageBreakBefore/>
+      </w:pPr>
+      <w:r>
+        <w:rPr>
+          <w:rFonts w:ascii="Arial" w:hAnsi="Arial"/>
+          <w:color w:val="000000"/>
+          <w:sz w:val="24"/>
+          <w:b/>
+        </w:rPr>
+        <w:t>APÊNDICE B — DER de rotinas e relacionamento</w:t>
+      </w:r>
+    </w:p>
+    <w:p>
+      <w:pPr>
+        <w:pStyle w:val="Normal"/>
+        <w:spacing w:before="0" w:after="120" w:line="240" w:lineRule="auto"/>
+        <w:ind w:left="0" w:right="0" w:firstLine="0"/>
+        <w:jc w:val="left"/>
+      </w:pPr>
+      <w:r>
+        <w:rPr>
+          <w:rFonts w:ascii="Arial" w:hAnsi="Arial"/>
+          <w:color w:val="000000"/>
+          <w:sz w:val="21"/>
+        </w:rPr>
+        <w:t>Diagrama de Entidade e Relacionamento — visão 4 de 4; conjunto com os 41 modelos persistidos.</w:t>
+      </w:r>
+    </w:p>
+    <w:p>
+      <w:pPr>
+        <w:spacing w:before="0" w:after="80" w:line="240" w:lineRule="auto"/>
+        <w:ind w:left="0" w:firstLine="0"/>
+        <w:jc w:val="center"/>
+      </w:pPr>
+      <w:r>
+        <w:drawing>
+          <wp:inline distT="0" distB="0" distL="0" distR="0">
+            <wp:extent cx="11460298" cy="7704000"/>
+            <wp:docPr id="13" name="der-4" descr="der-4 do Nexly baseado no schema Prisma"/>
+            <wp:cNvGraphicFramePr>
+              <a:graphicFrameLocks noChangeAspect="1"/>
+            </wp:cNvGraphicFramePr>
+            <a:graphic>
+              <a:graphicData uri="http://schemas.openxmlformats.org/drawingml/2006/picture">
+                <pic:pic>
+                  <pic:nvPicPr>
+                    <pic:cNvPr id="0" name="der-4.png"/>
+                    <pic:cNvPicPr/>
+                  </pic:nvPicPr>
+                  <pic:blipFill>
+                    <a:blip r:embed="rId25"/>
+                    <a:stretch>
+                      <a:fillRect/>
+                    </a:stretch>
+                  </pic:blipFill>
+                  <pic:spPr>
+                    <a:xfrm>
+                      <a:off x="0" y="0"/>
+                      <a:ext cx="11460298" cy="7704000"/>
+                    </a:xfrm>
+                    <a:prstGeom prst="rect">
+                      <a:avLst/>
+                    </a:prstGeom>
+                  </pic:spPr>
+                </pic:pic>
+              </a:graphicData>
+            </a:graphic>
+          </wp:inline>
+        </w:drawing>
+      </w:r>
+    </w:p>
+    <w:p>
+      <w:pPr>
+        <w:pStyle w:val="Normal"/>
+        <w:spacing w:before="0" w:after="120" w:line="240" w:lineRule="auto"/>
+        <w:ind w:left="0" w:right="0" w:firstLine="0"/>
+        <w:jc w:val="left"/>
+      </w:pPr>
+      <w:r>
+        <w:rPr>
+          <w:rFonts w:ascii="Arial" w:hAnsi="Arial"/>
+          <w:color w:val="000000"/>
+          <w:sz w:val="20"/>
+        </w:rPr>
+        <w:t>Legenda: PK = chave primária; UK = unicidade do campo; FK = chave estrangeira; ESC = escopo por empresa sem FK declarada; ? = opcional. Atributos principais selecionados; tipos conforme Prisma.</w:t>
+      </w:r>
+    </w:p>
+    <w:p>
+      <w:pPr>
+        <w:pStyle w:val="Normal"/>
+        <w:spacing w:before="0" w:after="120" w:line="240" w:lineRule="auto"/>
+        <w:ind w:left="0" w:right="0" w:firstLine="0"/>
+        <w:jc w:val="left"/>
+      </w:pPr>
+      <w:r>
+        <w:rPr>
+          <w:rFonts w:ascii="Arial" w:hAnsi="Arial"/>
+          <w:color w:val="000000"/>
+          <w:sz w:val="20"/>
+        </w:rPr>
+        <w:t>As linhas mostram relações internas selecionadas. Os destinos das demais FKs, inclusive entre visões e para empresas, constam nos campos. Nomes de tabelas conforme o mapeamento do schema.</w:t>
+      </w:r>
+    </w:p>
+    <w:p>
+      <w:pPr>
+        <w:pStyle w:val="Normal"/>
+        <w:spacing w:before="0" w:after="120" w:line="240" w:lineRule="auto"/>
+        <w:ind w:left="0" w:right="0" w:firstLine="0"/>
+        <w:jc w:val="left"/>
+      </w:pPr>
+      <w:r>
+        <w:rPr>
+          <w:rFonts w:ascii="Arial" w:hAnsi="Arial"/>
+          <w:color w:val="000000"/>
+          <w:sz w:val="20"/>
+        </w:rPr>
+        <w:t>Fonte: elaboração própria com base em apps/api/prisma/schema.prisma do Nexly.</w:t>
+      </w:r>
+    </w:p>
     <w:sectPr>
-      <w:headerReference r:id="rId19" w:type="default"/>
-      <w:footerReference r:id="rId20" w:type="default"/>
       <w:type w:val="nextPage"/>
-      <w:pgSz w:h="16838" w:w="11906" w:orient="portrait"/>
-      <w:pgMar w:bottom="1133.8582677165355" w:top="1700.7874015748032" w:left="1700.7874015748032" w:right="1133.8582677165355" w:header="850" w:footer="567"/>
+      <w:pgSz w:w="23811" w:h="16838" w:orient="landscape"/>
+      <w:pgMar w:top="1134" w:bottom="1134" w:left="1134" w:right="1134" w:header="567" w:footer="567"/>
     </w:sectPr>
   </w:body>
 </w:document>

</xml_diff>

<commit_message>
docs: finalize README and update product screenshots preserving original documentation
</commit_message>
<xml_diff>
--- a/docs/documentacao/Nexly_Documentação.docx
+++ b/docs/documentacao/Nexly_Documentação.docx
@@ -9929,7 +9929,7 @@
           <w:szCs w:val="20"/>
           <w:rtl w:val="0"/>
         </w:rPr>
-        <w:t xml:space="preserve">Figura 3 — Busca rápida em tela de celular</w:t>
+        <w:t xml:space="preserve">Figura 3 — Painel geral da versão atual do Nexly</w:t>
       </w:r>
       <w:r>
         <w:rPr>
@@ -9950,9 +9950,9 @@
         <w:rPr/>
         <w:drawing>
           <wp:inline distB="0" distT="0" distL="0" distR="0">
-            <wp:extent cx="1703037" cy="4571999"/>
+            <wp:extent cx="5753100" cy="2638212"/>
             <wp:effectExtent b="0" l="0" r="0" t="0"/>
-            <wp:docPr id="5" name="image13.png"/>
+            <wp:docPr id="5" name="image13.png" descr="Painel geral da versão atual do Nexly"/>
             <a:graphic>
               <a:graphicData uri="http://schemas.openxmlformats.org/drawingml/2006/picture">
                 <pic:pic>
@@ -9970,7 +9970,7 @@
                   <pic:spPr>
                     <a:xfrm>
                       <a:off x="0" y="0"/>
-                      <a:ext cx="1703037" cy="4571999"/>
+                      <a:ext cx="5753100" cy="2638212"/>
                     </a:xfrm>
                     <a:prstGeom prst="rect"/>
                     <a:ln/>
@@ -10613,7 +10613,7 @@
           <w:szCs w:val="20"/>
           <w:rtl w:val="0"/>
         </w:rPr>
-        <w:t xml:space="preserve">Figura 5 — Pedido recebido no cenário de teste</w:t>
+        <w:t xml:space="preserve">Figura 5 — Pedidos de compra na versão atual do Nexly</w:t>
       </w:r>
       <w:r>
         <w:rPr>
@@ -10634,9 +10634,9 @@
         <w:rPr/>
         <w:drawing>
           <wp:inline distB="0" distT="0" distL="0" distR="0">
-            <wp:extent cx="2112654" cy="4572000"/>
+            <wp:extent cx="5753100" cy="2653201"/>
             <wp:effectExtent b="0" l="0" r="0" t="0"/>
-            <wp:docPr id="7" name="image1.png"/>
+            <wp:docPr id="7" name="image1.png" descr="Pedidos de compra na versão atual do Nexly"/>
             <a:graphic>
               <a:graphicData uri="http://schemas.openxmlformats.org/drawingml/2006/picture">
                 <pic:pic>
@@ -10654,7 +10654,7 @@
                   <pic:spPr>
                     <a:xfrm>
                       <a:off x="0" y="0"/>
-                      <a:ext cx="2112654" cy="4572000"/>
+                      <a:ext cx="5753100" cy="2653201"/>
                     </a:xfrm>
                     <a:prstGeom prst="rect"/>
                     <a:ln/>
@@ -10770,7 +10770,7 @@
           <w:szCs w:val="20"/>
           <w:rtl w:val="0"/>
         </w:rPr>
-        <w:t xml:space="preserve">Figura 6 — Comissões com um atendimento de teste</w:t>
+        <w:t xml:space="preserve">Figura 6 — Comissões na versão atual do Nexly</w:t>
       </w:r>
       <w:r>
         <w:rPr>
@@ -10791,9 +10791,9 @@
         <w:rPr/>
         <w:drawing>
           <wp:inline distB="0" distT="0" distL="0" distR="0">
-            <wp:extent cx="2112654" cy="4572000"/>
+            <wp:extent cx="5753100" cy="2671189"/>
             <wp:effectExtent b="0" l="0" r="0" t="0"/>
-            <wp:docPr id="6" name="image12.png"/>
+            <wp:docPr id="6" name="image12.png" descr="Comissões na versão atual do Nexly"/>
             <a:graphic>
               <a:graphicData uri="http://schemas.openxmlformats.org/drawingml/2006/picture">
                 <pic:pic>
@@ -10811,7 +10811,7 @@
                   <pic:spPr>
                     <a:xfrm>
                       <a:off x="0" y="0"/>
-                      <a:ext cx="2112654" cy="4572000"/>
+                      <a:ext cx="5753100" cy="2671189"/>
                     </a:xfrm>
                     <a:prstGeom prst="rect"/>
                     <a:ln/>

</xml_diff>